<commit_message>
Fix R-02: write ALAC into an M4A container
FFmpeg picks its muxer from the output file's extension, and `.alac` names a
codec, not a container, so every ALAC conversion died with "Error initializing
the muxer ... Invalid argument" while the argument-level tests passed. Output
names now come from one container-extension mapping, so ALAC is written as
`song.m4a` and the audio decodes bit-identically to the source. The converter
guide, format description and CHANGELOG state the shared `.m4a` extension and
that a later run to either ALAC or AAC-M4A replaces the earlier file.
</commit_message>
<xml_diff>
--- a/user_guides/individual_programs/music_format_converter/Music_Format_Converter_User_Guide.docx
+++ b/user_guides/individual_programs/music_format_converter/Music_Format_Converter_User_Guide.docx
@@ -134,7 +134,21 @@
         <w:t xml:space="preserve">Lossless/uncompressed: </w:t>
       </w:r>
       <w:r>
-        <w:t>FLAC, WAV, ALAC, APE, AIFF, AIF, WV, MPC, and DSF are recognized as lossless input categories.</w:t>
+        <w:t>FLAC, WAV, ALAC (M4A container), APE, AIFF, AIF, WV, MPC, and DSF are recognized as lossless input categories.</w:t>
+      </w:r>
+    </w:p>
+    <w:p>
+      <w:pPr>
+        <w:pStyle w:val="ListBullet"/>
+      </w:pPr>
+      <w:r>
+        <w:rPr>
+          <w:b/>
+        </w:rPr>
+        <w:t xml:space="preserve">ALAC output: </w:t>
+      </w:r>
+      <w:r>
+        <w:t>ALAC is written inside an M4A container, so the output file is named with the .m4a extension, not .alac. ALAC and AAC-M4A share that extension, so a later run to either format replaces the earlier .m4a file with the same name.</w:t>
       </w:r>
     </w:p>
     <w:p>
@@ -550,7 +564,7 @@
         <w:t xml:space="preserve">ALAC: </w:t>
       </w:r>
       <w:r>
-        <w:t>Always lossless; no quality tiers apply.</w:t>
+        <w:t>Always lossless; no quality tiers apply. Output is an M4A-container file.</w:t>
       </w:r>
     </w:p>
     <w:p>

</xml_diff>